<commit_message>
Spanish templates: data protection, privacy, cookies, IT security, due diligence, volunteer agreement, data rights
Co-Authored-By: Claude Opus 5.5 <noreply@anthropic.com>
Claude-Session: https://claude.ai/code/session_012WEC1qutQtsV9VUQGDVAHW
</commit_message>
<xml_diff>
--- a/assets/legal-templates/es/gift-acceptance-policy.docx
+++ b/assets/legal-templates/es/gift-acceptance-policy.docx
@@ -3304,7 +3304,7 @@
                 <w:sz w:val="19"/>
                 <w:szCs w:val="19"/>
               </w:rPr>
-              <w:t xml:space="preserve">Enumera las leyes que se aplican a tus donaciones. Ámbitos habituales que comprobar: las normas sobre la recepción de financiación extranjera (por ejemplo, en la India las contribuciones extranjeras están reguladas por la Foreign Contribution (Regulation) Act 2010 y deben recibirse en una cuenta designada); las normas sobre la emisión de recibos fiscales a las personas donantes (por ejemplo, en los EE. UU. una persona donante necesita un acuse de recibo por escrito para un regalo de 250 USD o más, y en el Reino Unido el Gift Aid tiene sus propias normas de declaración); los permisos para la recaudación pública de fondos; y las obligaciones de prevención del blanqueo de capitales. Si no estás segura de qué se aplica, consulta tu ley local sobre recaudación de fondos y financiación extranjera antes de aceptar donaciones internacionales.</w:t>
+              <w:t xml:space="preserve">Enumera las leyes que se aplican a tus donaciones. Ámbitos habituales que comprobar: las normas sobre la recepción de financiación extranjera (por ejemplo, en la India las contribuciones extranjeras están reguladas por la Foreign Contribution (Regulation) Act 2010 y deben recibirse en una cuenta designada); las normas sobre la emisión de recibos fiscales a las personas donantes (por ejemplo, en los EE. UU. una persona donante necesita un acuse de recibo por escrito para un regalo de 250 USD o más, y en el Reino Unido el Gift Aid tiene sus propias normas de declaración); los permisos para la recaudación pública de fondos; y las obligaciones de prevención del blanqueo de capitales. Si tienes dudas sobre qué se aplica, consulta tu ley local sobre recaudación de fondos y financiación extranjera antes de aceptar donaciones internacionales.</w:t>
             </w:r>
           </w:p>
         </w:tc>
@@ -5411,7 +5411,7 @@
                 <w:sz w:val="19"/>
                 <w:szCs w:val="19"/>
               </w:rPr>
-              <w:t xml:space="preserve">Decide de qué sectores o personas donantes no aceptarás dinero, en función de tu misión. Una organización de salud puede rechazar el dinero del tabaco y del alcohol; un grupo ambientalista puede rechazar a las empresas de combustibles fósiles; un grupo de construcción de paz puede rechazar a los partidos políticos. Algunas organizaciones excluyen la financiación gubernamental para seguir siendo independientes. Sé concreta: las normas vagas son difíciles de aplicar. Pide al órgano de gobierno que apruebe la lista.</w:t>
+              <w:t xml:space="preserve">Decide de qué sectores o personas donantes no aceptarás dinero, en función de tu misión. Una organización de salud puede rechazar el dinero del tabaco y del alcohol; un grupo ambientalista puede rechazar a las empresas de combustibles fósiles; un grupo de construcción de paz puede rechazar a los partidos políticos. Algunas organizaciones excluyen la financiación gubernamental para seguir siendo independientes. Concreta al máximo: las normas vagas son difíciles de aplicar. Pide al órgano de gobierno que apruebe la lista.</w:t>
             </w:r>
           </w:p>
         </w:tc>

</xml_diff>